<commit_message>
Refactor session management and enhance user experience
- Improved session expiration handling by adding a notification banner for users.
- Updated the settings page to allow users to manage their profile and preferences more effectively.
- Enhanced backend patient document handling to ensure proper access control based on user roles.
</commit_message>
<xml_diff>
--- a/frontend/src/docs/Medical Schedule Template.docx
+++ b/frontend/src/docs/Medical Schedule Template.docx
@@ -13,82 +13,6 @@
           <w:szCs w:val="20"/>
         </w:rPr>
       </w:pPr>
-      <w:r>
-        <w:rPr>
-          <w:noProof/>
-        </w:rPr>
-        <w:drawing>
-          <wp:anchor distT="0" distB="0" distL="114300" distR="114300" simplePos="0" relativeHeight="251658240" behindDoc="0" locked="0" layoutInCell="1" allowOverlap="1" wp14:anchorId="25D22955" wp14:editId="0A88761A">
-            <wp:simplePos x="0" y="0"/>
-            <wp:positionH relativeFrom="column">
-              <wp:posOffset>6681902</wp:posOffset>
-            </wp:positionH>
-            <wp:positionV relativeFrom="paragraph">
-              <wp:posOffset>-113665</wp:posOffset>
-            </wp:positionV>
-            <wp:extent cx="2882483" cy="559603"/>
-            <wp:effectExtent l="0" t="0" r="0" b="0"/>
-            <wp:wrapNone/>
-            <wp:docPr id="2" name="Picture 1">
-              <a:hlinkClick xmlns:a="http://schemas.openxmlformats.org/drawingml/2006/main" r:id="rId8"/>
-              <a:extLst xmlns:a="http://schemas.openxmlformats.org/drawingml/2006/main">
-                <a:ext uri="{FF2B5EF4-FFF2-40B4-BE49-F238E27FC236}">
-                  <a16:creationId xmlns:a16="http://schemas.microsoft.com/office/drawing/2014/main" id="{00000000-0008-0000-0000-000002000000}"/>
-                </a:ext>
-              </a:extLst>
-            </wp:docPr>
-            <wp:cNvGraphicFramePr>
-              <a:graphicFrameLocks xmlns:a="http://schemas.openxmlformats.org/drawingml/2006/main" noChangeAspect="1"/>
-            </wp:cNvGraphicFramePr>
-            <a:graphic xmlns:a="http://schemas.openxmlformats.org/drawingml/2006/main">
-              <a:graphicData uri="http://schemas.openxmlformats.org/drawingml/2006/picture">
-                <pic:pic xmlns:pic="http://schemas.openxmlformats.org/drawingml/2006/picture">
-                  <pic:nvPicPr>
-                    <pic:cNvPr id="2" name="Picture 1">
-                      <a:hlinkClick r:id="rId8"/>
-                      <a:extLst>
-                        <a:ext uri="{FF2B5EF4-FFF2-40B4-BE49-F238E27FC236}">
-                          <a16:creationId xmlns:a16="http://schemas.microsoft.com/office/drawing/2014/main" id="{00000000-0008-0000-0000-000002000000}"/>
-                        </a:ext>
-                      </a:extLst>
-                    </pic:cNvPr>
-                    <pic:cNvPicPr>
-                      <a:picLocks noChangeAspect="1"/>
-                    </pic:cNvPicPr>
-                  </pic:nvPicPr>
-                  <pic:blipFill>
-                    <a:blip r:embed="rId9">
-                      <a:extLst>
-                        <a:ext uri="{28A0092B-C50C-407E-A947-70E740481C1C}">
-                          <a14:useLocalDpi xmlns:a14="http://schemas.microsoft.com/office/drawing/2010/main" val="0"/>
-                        </a:ext>
-                      </a:extLst>
-                    </a:blip>
-                    <a:stretch>
-                      <a:fillRect/>
-                    </a:stretch>
-                  </pic:blipFill>
-                  <pic:spPr>
-                    <a:xfrm>
-                      <a:off x="0" y="0"/>
-                      <a:ext cx="2882483" cy="559603"/>
-                    </a:xfrm>
-                    <a:prstGeom prst="rect">
-                      <a:avLst/>
-                    </a:prstGeom>
-                  </pic:spPr>
-                </pic:pic>
-              </a:graphicData>
-            </a:graphic>
-            <wp14:sizeRelH relativeFrom="page">
-              <wp14:pctWidth>0</wp14:pctWidth>
-            </wp14:sizeRelH>
-            <wp14:sizeRelV relativeFrom="page">
-              <wp14:pctHeight>0</wp14:pctHeight>
-            </wp14:sizeRelV>
-          </wp:anchor>
-        </w:drawing>
-      </w:r>
       <w:r>
         <w:rPr>
           <w:rFonts w:ascii="Century Gothic" w:hAnsi="Century Gothic" w:cs="Arial"/>
@@ -7507,12 +7431,12 @@
           <w:szCs w:val="20"/>
         </w:rPr>
         <w:sectPr>
-          <w:headerReference w:type="even" r:id="rId10"/>
-          <w:headerReference w:type="default" r:id="rId11"/>
-          <w:footerReference w:type="even" r:id="rId12"/>
-          <w:footerReference w:type="default" r:id="rId13"/>
-          <w:headerReference w:type="first" r:id="rId14"/>
-          <w:footerReference w:type="first" r:id="rId15"/>
+          <w:headerReference w:type="even" r:id="rId8"/>
+          <w:headerReference w:type="default" r:id="rId9"/>
+          <w:footerReference w:type="even" r:id="rId10"/>
+          <w:footerReference w:type="default" r:id="rId11"/>
+          <w:headerReference w:type="first" r:id="rId12"/>
+          <w:footerReference w:type="first" r:id="rId13"/>
           <w:pgSz w:w="15840" w:h="12240" w:orient="landscape"/>
           <w:pgMar w:top="306" w:right="360" w:bottom="360" w:left="486" w:header="720" w:footer="720" w:gutter="0"/>
           <w:cols w:space="720"/>

</xml_diff>